<commit_message>
Tarea 3 - Actualización infografía Canva y correcciones informe
</commit_message>
<xml_diff>
--- a/tareas/tarea_3/Informe_Tarea3_Grupo06.docx
+++ b/tareas/tarea_3/Informe_Tarea3_Grupo06.docx
@@ -104,19 +104,7 @@
           <w:rPr>
             <w:rStyle w:val="Hipervnculo"/>
           </w:rPr>
-          <w:t>https://github.com/Carlon-S/Grupo06_INF3</w:t>
-        </w:r>
-        <w:r>
-          <w:rPr>
-            <w:rStyle w:val="Hipervnculo"/>
-          </w:rPr>
-          <w:t>7</w:t>
-        </w:r>
-        <w:r>
-          <w:rPr>
-            <w:rStyle w:val="Hipervnculo"/>
-          </w:rPr>
-          <w:t>9_2026-1</w:t>
+          <w:t>https://github.com/Carlon-S/Grupo06_INF379_2026-1</w:t>
         </w:r>
       </w:hyperlink>
     </w:p>
@@ -561,19 +549,7 @@
           <w:rPr>
             <w:rStyle w:val="Hipervnculo"/>
           </w:rPr>
-          <w:t>https://public.flourish.studio/visualisatio</w:t>
-        </w:r>
-        <w:r>
-          <w:rPr>
-            <w:rStyle w:val="Hipervnculo"/>
-          </w:rPr>
-          <w:t>n</w:t>
-        </w:r>
-        <w:r>
-          <w:rPr>
-            <w:rStyle w:val="Hipervnculo"/>
-          </w:rPr>
-          <w:t>/29363141/</w:t>
+          <w:t>https://public.flourish.studio/visualisation/29363141/</w:t>
         </w:r>
       </w:hyperlink>
       <w:r>
@@ -1191,12 +1167,21 @@
       <w:pPr>
         <w:jc w:val="both"/>
       </w:pPr>
+      <w:proofErr w:type="spellStart"/>
       <w:r>
         <w:rPr>
           <w:b/>
           <w:bCs/>
         </w:rPr>
-        <w:t>Coropleta (</w:t>
+        <w:t>Coropleta</w:t>
+      </w:r>
+      <w:proofErr w:type="spellEnd"/>
+      <w:r>
+        <w:rPr>
+          <w:b/>
+          <w:bCs/>
+        </w:rPr>
+        <w:t xml:space="preserve"> (</w:t>
       </w:r>
       <w:proofErr w:type="spellStart"/>
       <w:r>
@@ -1302,19 +1287,7 @@
           <w:rPr>
             <w:rStyle w:val="Hipervnculo"/>
           </w:rPr>
-          <w:t>https://datawrapper</w:t>
-        </w:r>
-        <w:r>
-          <w:rPr>
-            <w:rStyle w:val="Hipervnculo"/>
-          </w:rPr>
-          <w:t>.</w:t>
-        </w:r>
-        <w:r>
-          <w:rPr>
-            <w:rStyle w:val="Hipervnculo"/>
-          </w:rPr>
-          <w:t>dwcdn.net/I88RM/2/</w:t>
+          <w:t>https://datawrapper.dwcdn.net/I88RM/2/</w:t>
         </w:r>
       </w:hyperlink>
       <w:r>
@@ -1463,7 +1436,7 @@
         <w:pStyle w:val="Ttulo1"/>
       </w:pPr>
       <w:r>
-        <w:t>3. Infografía grupal (HTML/CSS)</w:t>
+        <w:t>3. Infografía grupal (Canva)</w:t>
       </w:r>
     </w:p>
     <w:p>
@@ -1477,77 +1450,53 @@
     <w:p>
       <w:pPr>
         <w:jc w:val="both"/>
-      </w:pPr>
-      <w:r>
-        <w:rPr>
-          <w:rFonts w:ascii="Aptos" w:eastAsia="Aptos" w:hAnsi="Aptos" w:cs="Aptos"/>
-        </w:rPr>
-        <w:t>La infografía grupal fue desarrollada e integrada mediante HTML y CSS, utilizando la fuente tipográfica Inter y un sistema de tokens de diseño personalizados, cumpliendo así con el requerimiento de consolidar el trabajo individual en una única pieza visual coherente. La estructura narrativa sigue una lectura descendente y secuencial: un encabezado con indicadores clave numéricos, seguido de un bloque central con los dos mapas en comparación directa, luego el desglose por línea y cobertura comunal, y finalmente un bloque de conclusiones que cierra el análisis.</w:t>
-      </w:r>
-    </w:p>
-    <w:p>
-      <w:pPr>
-        <w:pStyle w:val="Ttulo2"/>
-      </w:pPr>
-      <w:r>
-        <w:t>3.2 Integración de los dos mapas</w:t>
-      </w:r>
-    </w:p>
-    <w:p>
-      <w:pPr>
-        <w:jc w:val="both"/>
-        <w:rPr>
-          <w:rFonts w:ascii="Aptos" w:eastAsia="Aptos" w:hAnsi="Aptos" w:cs="Aptos"/>
-        </w:rPr>
-      </w:pPr>
-      <w:r>
-        <w:rPr>
-          <w:rFonts w:ascii="Aptos" w:eastAsia="Aptos" w:hAnsi="Aptos" w:cs="Aptos"/>
-        </w:rPr>
-        <w:t xml:space="preserve">En la infografía se integraron exitosamente dos representaciones cartográficas de naturaleza estadística distinta, logrando que dialoguen de forma armónica a pesar de haber sido generadas en plataformas independientes. Por un lado, se presenta el mapa coropleta elaborado por Diego Carlon en </w:t>
+        <w:rPr>
+          <w:rFonts w:ascii="Aptos" w:eastAsia="Aptos" w:hAnsi="Aptos" w:cs="Aptos"/>
+        </w:rPr>
+      </w:pPr>
+      <w:r>
+        <w:rPr>
+          <w:rFonts w:ascii="Aptos" w:eastAsia="Aptos" w:hAnsi="Aptos" w:cs="Aptos"/>
+        </w:rPr>
+        <w:t xml:space="preserve">La infografía grupal fue desarrollada e integrada utilizando la plataforma </w:t>
       </w:r>
       <w:proofErr w:type="spellStart"/>
       <w:r>
         <w:rPr>
           <w:rFonts w:ascii="Aptos" w:eastAsia="Aptos" w:hAnsi="Aptos" w:cs="Aptos"/>
         </w:rPr>
-        <w:t>Datawrapper</w:t>
+        <w:t>Canva</w:t>
       </w:r>
       <w:proofErr w:type="spellEnd"/>
       <w:r>
         <w:rPr>
           <w:rFonts w:ascii="Aptos" w:eastAsia="Aptos" w:hAnsi="Aptos" w:cs="Aptos"/>
         </w:rPr>
-        <w:t xml:space="preserve">, el cual clasifica el territorio mediante polígonos comunales coloreados según la intensidad de la variable cuantitativa correspondiente a la cantidad de estaciones presentes en cada comuna. Por otro lado, se incluye el mapa de puntos o burbujas diseñado por Joshua Serin </w:t>
-      </w:r>
-      <w:r>
-        <w:rPr>
-          <w:rFonts w:ascii="Aptos" w:eastAsia="Aptos" w:hAnsi="Aptos" w:cs="Aptos"/>
-        </w:rPr>
-        <w:lastRenderedPageBreak/>
-        <w:t>mediante Flourish, que posiciona cada detención en sus coordenadas geográficas exactas, utilizando además la variable visual del color para distinguir las distintas líneas de la red y el tamaño de los círculos para resaltar la presencia de nodos de combinación. Ambos elementos fueron posicionados de manera adyacente en una cuadrícula simétrica dentro del diseño general, unificados visualmente mediante el uso de marcadores de colores, títulos estandarizados y cuadros de hallazgos explicativos que facilitan una lectura comparativa y complementaria del fenómeno urbano.</w:t>
-      </w:r>
-    </w:p>
-    <w:p>
-      <w:pPr>
-        <w:jc w:val="both"/>
-        <w:rPr>
-          <w:rFonts w:ascii="Aptos" w:eastAsia="Aptos" w:hAnsi="Aptos" w:cs="Aptos"/>
-        </w:rPr>
-      </w:pPr>
-    </w:p>
-    <w:p>
-      <w:pPr>
-        <w:jc w:val="both"/>
-        <w:rPr>
-          <w:rFonts w:ascii="Aptos" w:eastAsia="Aptos" w:hAnsi="Aptos" w:cs="Aptos"/>
-        </w:rPr>
-      </w:pPr>
-      <w:r>
-        <w:rPr>
-          <w:rFonts w:ascii="Aptos" w:eastAsia="Aptos" w:hAnsi="Aptos" w:cs="Aptos"/>
-        </w:rPr>
-        <w:t xml:space="preserve">Notar que la infografía se encuentra en el repositorio debido a su tamaño: </w:t>
+        <w:t xml:space="preserve">. </w:t>
+      </w:r>
+      <w:r>
+        <w:rPr>
+          <w:rFonts w:ascii="Aptos" w:eastAsia="Aptos" w:hAnsi="Aptos" w:cs="Aptos"/>
+        </w:rPr>
+        <w:t>E</w:t>
+      </w:r>
+      <w:r>
+        <w:rPr>
+          <w:rFonts w:ascii="Aptos" w:eastAsia="Aptos" w:hAnsi="Aptos" w:cs="Aptos"/>
+        </w:rPr>
+        <w:t>nlace</w:t>
+      </w:r>
+      <w:r>
+        <w:rPr>
+          <w:rFonts w:ascii="Aptos" w:eastAsia="Aptos" w:hAnsi="Aptos" w:cs="Aptos"/>
+        </w:rPr>
+        <w:t xml:space="preserve"> para ver la infografía adecuadamente</w:t>
+      </w:r>
+      <w:r>
+        <w:rPr>
+          <w:rFonts w:ascii="Aptos" w:eastAsia="Aptos" w:hAnsi="Aptos" w:cs="Aptos"/>
+        </w:rPr>
+        <w:t xml:space="preserve">: </w:t>
       </w:r>
       <w:hyperlink r:id="rId15" w:history="1">
         <w:r>
@@ -1555,21 +1504,7 @@
             <w:rStyle w:val="Hipervnculo"/>
             <w:rFonts w:ascii="Aptos" w:eastAsia="Aptos" w:hAnsi="Aptos" w:cs="Aptos"/>
           </w:rPr>
-          <w:t>https://github.com/Carlon-S/Grupo06_INF379_2026-1/tree/main/tareas/tarea_</w:t>
-        </w:r>
-        <w:r>
-          <w:rPr>
-            <w:rStyle w:val="Hipervnculo"/>
-            <w:rFonts w:ascii="Aptos" w:eastAsia="Aptos" w:hAnsi="Aptos" w:cs="Aptos"/>
-          </w:rPr>
-          <w:t>3</w:t>
-        </w:r>
-        <w:r>
-          <w:rPr>
-            <w:rStyle w:val="Hipervnculo"/>
-            <w:rFonts w:ascii="Aptos" w:eastAsia="Aptos" w:hAnsi="Aptos" w:cs="Aptos"/>
-          </w:rPr>
-          <w:t>/grupal</w:t>
+          <w:t>https://canva.link/5o6qz2aefvehxvn</w:t>
         </w:r>
       </w:hyperlink>
     </w:p>
@@ -1578,6 +1513,49 @@
         <w:pStyle w:val="Ttulo2"/>
       </w:pPr>
       <w:r>
+        <w:t>3.2 Integración de los dos mapas</w:t>
+      </w:r>
+    </w:p>
+    <w:p>
+      <w:pPr>
+        <w:jc w:val="both"/>
+        <w:rPr>
+          <w:rFonts w:ascii="Aptos" w:eastAsia="Aptos" w:hAnsi="Aptos" w:cs="Aptos"/>
+        </w:rPr>
+      </w:pPr>
+      <w:r>
+        <w:rPr>
+          <w:rFonts w:ascii="Aptos" w:eastAsia="Aptos" w:hAnsi="Aptos" w:cs="Aptos"/>
+        </w:rPr>
+        <w:t xml:space="preserve">En la infografía se integraron exitosamente dos representaciones cartográficas de naturaleza estadística distinta, logrando que dialoguen de forma armónica a pesar de haber sido generadas en plataformas independientes. Por un lado, se presenta el mapa coropleta elaborado por Diego Carlon en </w:t>
+      </w:r>
+      <w:proofErr w:type="spellStart"/>
+      <w:r>
+        <w:rPr>
+          <w:rFonts w:ascii="Aptos" w:eastAsia="Aptos" w:hAnsi="Aptos" w:cs="Aptos"/>
+        </w:rPr>
+        <w:t>Datawrapper</w:t>
+      </w:r>
+      <w:proofErr w:type="spellEnd"/>
+      <w:r>
+        <w:rPr>
+          <w:rFonts w:ascii="Aptos" w:eastAsia="Aptos" w:hAnsi="Aptos" w:cs="Aptos"/>
+        </w:rPr>
+        <w:t xml:space="preserve">, el cual clasifica el territorio mediante polígonos comunales coloreados según la intensidad de la variable cuantitativa correspondiente a la cantidad de estaciones presentes en cada comuna. Por otro lado, se incluye el mapa de puntos o burbujas diseñado por Joshua Serin mediante Flourish, que posiciona cada detención en sus coordenadas geográficas exactas, utilizando además la variable visual del color para distinguir las distintas líneas de la red y el tamaño de los círculos para resaltar la presencia de nodos de combinación. Ambos elementos fueron posicionados de manera adyacente en una cuadrícula simétrica dentro del diseño general, unificados visualmente mediante el </w:t>
+      </w:r>
+      <w:r>
+        <w:rPr>
+          <w:rFonts w:ascii="Aptos" w:eastAsia="Aptos" w:hAnsi="Aptos" w:cs="Aptos"/>
+        </w:rPr>
+        <w:lastRenderedPageBreak/>
+        <w:t>uso de marcadores de colores, títulos estandarizados y cuadros de hallazgos explicativos que facilitan una lectura comparativa y complementaria del fenómeno urbano.</w:t>
+      </w:r>
+    </w:p>
+    <w:p>
+      <w:pPr>
+        <w:pStyle w:val="Ttulo2"/>
+      </w:pPr>
+      <w:r>
         <w:t>3.3 Comentarios y conclusiones por cada mapa</w:t>
       </w:r>
     </w:p>
@@ -1608,14 +1586,47 @@
         <w:rPr>
           <w:rFonts w:ascii="Aptos" w:eastAsia="Aptos" w:hAnsi="Aptos" w:cs="Aptos"/>
         </w:rPr>
-        <w:t xml:space="preserve">Para asegurar la máxima legibilidad y coherencia visual, la infografía fue concebida bajo un esquema de alto contraste con fondo negro (#0a0a0a), superficies en gris oscuro y un único acento cromático en rojo (#e84642), que corresponde al color oficial de la Línea 1 y actúa como hilo conductor del diseño. Esta decisión cromática permite que los colores de datos —los colores oficiales de las 7 líneas del Metro— destaquen con claridad sobre el fondo neutro, sin competir con elementos de la interfaz. La </w:t>
+        <w:t>Para asegurar la máxima legibilidad y coherencia visual, la infografía fue diseñada en Canva bajo un esquema de alto contraste, empleando fondos oscuros que permiten destacar la paleta de colores oficial del Metro de Santiago para cada línea (rojo L1, amarillo L2, azul L4, entre otros). La tipografía seleccionada es de la familia sans-serif, garantizando una estética moderna y de fácil lectura en pantalla. La jerarquía de la información se estructuró modulando tamaños y pesos tipográficos: cifras clave en gran tamaño para las métricas principales, etiquetas en mayúsculas para las secciones, y texto regular para los hallazgos, logrando un diseño visualmente ordenado, coherente y profesional.</w:t>
+      </w:r>
+    </w:p>
+    <w:p>
+      <w:pPr>
+        <w:pStyle w:val="Ttulo1"/>
+      </w:pPr>
+      <w:r>
+        <w:t>4. Conclusiones generales</w:t>
+      </w:r>
+    </w:p>
+    <w:p>
+      <w:pPr>
+        <w:jc w:val="both"/>
+      </w:pPr>
+      <w:r>
+        <w:rPr>
+          <w:rFonts w:ascii="Aptos" w:eastAsia="Aptos" w:hAnsi="Aptos" w:cs="Aptos"/>
+        </w:rPr>
+        <w:t xml:space="preserve">El desarrollo integral de este proyecto demuestra de forma contundente cómo la combinación de múltiples técnicas de visualización de datos enriquece significativamente la comprensión de fenómenos urbanos complejos, como lo es la movilidad metropolitana y la planificación del transporte. La superposición analítica </w:t>
       </w:r>
       <w:r>
         <w:rPr>
           <w:rFonts w:ascii="Aptos" w:eastAsia="Aptos" w:hAnsi="Aptos" w:cs="Aptos"/>
         </w:rPr>
         <w:lastRenderedPageBreak/>
-        <w:t>tipografía utilizada es Inter (sans-serif), seleccionada por su legibilidad en pantalla y su carácter moderno. La jerarquía de información se articula mediante pesos tipográficos (900 para métricas clave, 600–700 para títulos, 400 para cuerpo), etiquetas en mayúsculas con espaciado amplio y numeración de sección (01–04) para orientar la lectura.</w:t>
+        <w:t xml:space="preserve">de un mapa de puntos, que detalla la operatividad del servicio y las trayectorias exactas de la red, con un mapa coropleta, que dimensiona el impacto territorial de esta infraestructura a nivel político-administrativo, permite evidenciar sin lugar a dudas, las disparidades espaciales en la inversión pública y las serias limitaciones de conectividad en las comunas periféricas. El éxito de la entrega grupal radicó en la estricta coordinación técnica de los integrantes para procesar y depurar un único conjunto de datos oficiales proveniente de los archivos GTFS vigentes, garantizando con ello que las representaciones generadas en plataformas disímiles como Datawrapper y Flourish mantuvieran una congruencia matemática y espacial absoluta al ser finalmente ensambladas dentro del reporte visual en </w:t>
+      </w:r>
+      <w:proofErr w:type="spellStart"/>
+      <w:r>
+        <w:rPr>
+          <w:rFonts w:ascii="Aptos" w:eastAsia="Aptos" w:hAnsi="Aptos" w:cs="Aptos"/>
+        </w:rPr>
+        <w:t>Canva</w:t>
+      </w:r>
+      <w:proofErr w:type="spellEnd"/>
+      <w:r>
+        <w:rPr>
+          <w:rFonts w:ascii="Aptos" w:eastAsia="Aptos" w:hAnsi="Aptos" w:cs="Aptos"/>
+        </w:rPr>
+        <w:t>.</w:t>
       </w:r>
     </w:p>
     <w:p>
@@ -1623,7 +1634,15 @@
         <w:pStyle w:val="Ttulo1"/>
       </w:pPr>
       <w:r>
-        <w:t>4. Conclusiones generales</w:t>
+        <w:t>5. Anexos</w:t>
+      </w:r>
+    </w:p>
+    <w:p>
+      <w:pPr>
+        <w:pStyle w:val="Ttulo2"/>
+      </w:pPr>
+      <w:r>
+        <w:t>5.1 Enlaces a visualizaciones interactivas</w:t>
       </w:r>
     </w:p>
     <w:p>
@@ -1634,60 +1653,7 @@
         <w:rPr>
           <w:rFonts w:ascii="Aptos" w:eastAsia="Aptos" w:hAnsi="Aptos" w:cs="Aptos"/>
         </w:rPr>
-        <w:t>El desarrollo integral de este proyecto demuestra de forma contundente cómo la combinación de múltiples técnicas de visualización de datos enriquece significativamente la comprensión de fenómenos urbanos complejos, como lo es la movilidad metropolitana y la planificación del transporte. La superposición analítica de un mapa de puntos, que detalla la operatividad del servicio y las trayectorias exactas de la red, con un mapa coropleta, que dimensiona el impacto territorial de esta infraestructura a nivel político-administrativo, permite evidenciar sin lugar a dudas</w:t>
-      </w:r>
-      <w:r>
-        <w:rPr>
-          <w:rFonts w:ascii="Aptos" w:eastAsia="Aptos" w:hAnsi="Aptos" w:cs="Aptos"/>
-        </w:rPr>
-        <w:t>,</w:t>
-      </w:r>
-      <w:r>
-        <w:rPr>
-          <w:rFonts w:ascii="Aptos" w:eastAsia="Aptos" w:hAnsi="Aptos" w:cs="Aptos"/>
-        </w:rPr>
-        <w:t xml:space="preserve"> las disparidades espaciales en la inversión pública y las serias limitaciones de conectividad en las comunas periféricas. El éxito de la entrega grupal radicó en la estricta coordinación técnica de los integrantes para procesar y depurar un único conjunto de datos oficiales proveniente de los archivos GTFS vigentes, garantizando con ello que las representaciones generadas en plataformas disímiles como </w:t>
-      </w:r>
-      <w:proofErr w:type="spellStart"/>
-      <w:r>
-        <w:rPr>
-          <w:rFonts w:ascii="Aptos" w:eastAsia="Aptos" w:hAnsi="Aptos" w:cs="Aptos"/>
-        </w:rPr>
-        <w:t>Datawrapper</w:t>
-      </w:r>
-      <w:proofErr w:type="spellEnd"/>
-      <w:r>
-        <w:rPr>
-          <w:rFonts w:ascii="Aptos" w:eastAsia="Aptos" w:hAnsi="Aptos" w:cs="Aptos"/>
-        </w:rPr>
-        <w:t xml:space="preserve"> y Flourish mantuvieran una congruencia matemática y espacial absoluta al ser finalmente ensambladas dentro del reporte visual en HTML/CSS.</w:t>
-      </w:r>
-    </w:p>
-    <w:p>
-      <w:pPr>
-        <w:pStyle w:val="Ttulo1"/>
-      </w:pPr>
-      <w:r>
-        <w:t>5. Anexos</w:t>
-      </w:r>
-    </w:p>
-    <w:p>
-      <w:pPr>
-        <w:pStyle w:val="Ttulo2"/>
-      </w:pPr>
-      <w:r>
-        <w:t>5.1 Enlaces a visualizaciones interactivas</w:t>
-      </w:r>
-    </w:p>
-    <w:p>
-      <w:pPr>
-        <w:jc w:val="both"/>
-      </w:pPr>
-      <w:r>
-        <w:rPr>
-          <w:rFonts w:ascii="Aptos" w:eastAsia="Aptos" w:hAnsi="Aptos" w:cs="Aptos"/>
-        </w:rPr>
-        <w:t>Los resultados finales de las visualizaciones dinámicas se encuentran publicados y accesibles en sus respectivas plataformas web, permitiendo la exploración de la información geográfica detallada. El mapa de puntos enfocado en la red y sus nodos, creado por Joshua Serin, está alojado en los servidores de Flourish mediante el enlace interactivo</w:t>
+        <w:t>Los resultados finales de las visualizaciones dinámicas se encuentran publicados y accesibles en sus respectivas plataformas web, permitiendo la exploración de la información geográfica detallada. El mapa de puntos enfocado en la red y sus nodos, creado por Joshua Serin, está alojado en los servidores de Flourish mediante el enlace interactivohttps://public.flourish.studio/visualisation/29363141/. Por su parte, el mapa coropleta de densidad comunal, desarrollado por Diego Carlon, puede ser consultado directamente a través del enlace de Datawrapper https://datawrapper.dwcdn.net/I88RM/2/ . Adicionalmente, el documento matriz creado en Canva que agrupa ambos gráficos se adjunta a esta entrega para su revisión general.</w:t>
       </w:r>
       <w:hyperlink r:id="rId16" w:tgtFrame="_blank" w:tooltip="https://public.flourish.studio/visualisation/29363141/" w:history="1">
         <w:r>
@@ -1695,122 +1661,67 @@
             <w:rStyle w:val="Hipervnculo"/>
             <w:rFonts w:ascii="Aptos" w:eastAsia="Aptos" w:hAnsi="Aptos" w:cs="Aptos"/>
           </w:rPr>
-          <w:t>https://public.flourish.studio/visualis</w:t>
-        </w:r>
-        <w:r>
-          <w:rPr>
-            <w:rStyle w:val="Hipervnculo"/>
-            <w:rFonts w:ascii="Aptos" w:eastAsia="Aptos" w:hAnsi="Aptos" w:cs="Aptos"/>
-          </w:rPr>
-          <w:t>a</w:t>
-        </w:r>
-        <w:r>
-          <w:rPr>
-            <w:rStyle w:val="Hipervnculo"/>
-            <w:rFonts w:ascii="Aptos" w:eastAsia="Aptos" w:hAnsi="Aptos" w:cs="Aptos"/>
-          </w:rPr>
-          <w:t>tion/29363141/</w:t>
+          <w:t>https://public.flourish.studio/visualisation/29363141/</w:t>
         </w:r>
       </w:hyperlink>
-      <w:r>
-        <w:rPr>
-          <w:rFonts w:ascii="Aptos" w:eastAsia="Aptos" w:hAnsi="Aptos" w:cs="Aptos"/>
-        </w:rPr>
-        <w:t xml:space="preserve">. Por su parte, el mapa coropleta de densidad comunal, desarrollado por Diego Carlon, puede ser consultado directamente a través del enlace de </w:t>
-      </w:r>
-      <w:proofErr w:type="spellStart"/>
-      <w:r>
-        <w:rPr>
-          <w:rFonts w:ascii="Aptos" w:eastAsia="Aptos" w:hAnsi="Aptos" w:cs="Aptos"/>
-        </w:rPr>
-        <w:t>Datawrapper</w:t>
-      </w:r>
-      <w:proofErr w:type="spellEnd"/>
-      <w:r>
-        <w:rPr>
-          <w:rFonts w:ascii="Aptos" w:eastAsia="Aptos" w:hAnsi="Aptos" w:cs="Aptos"/>
-        </w:rPr>
-        <w:t xml:space="preserve"> </w:t>
-      </w:r>
       <w:hyperlink r:id="rId17" w:history="1">
         <w:r>
           <w:rPr>
             <w:rStyle w:val="Hipervnculo"/>
           </w:rPr>
-          <w:t>https://datawrapper.dwcdn.net/I</w:t>
-        </w:r>
-        <w:r>
-          <w:rPr>
-            <w:rStyle w:val="Hipervnculo"/>
-          </w:rPr>
-          <w:t>8</w:t>
-        </w:r>
-        <w:r>
-          <w:rPr>
-            <w:rStyle w:val="Hipervnculo"/>
-          </w:rPr>
-          <w:t>8RM/2/</w:t>
+          <w:t>https://datawrapper.dwcdn.net/I88RM/2/</w:t>
         </w:r>
       </w:hyperlink>
-      <w:r>
-        <w:t xml:space="preserve"> </w:t>
-      </w:r>
-      <w:r>
-        <w:rPr>
-          <w:rFonts w:ascii="Aptos" w:eastAsia="Aptos" w:hAnsi="Aptos" w:cs="Aptos"/>
-        </w:rPr>
-        <w:t>. Adicionalmente, el documento matriz creado en HTML/CSS que agrupa ambos gráficos se adjunta a esta entrega para su revisión general.</w:t>
-      </w:r>
     </w:p>
     <w:p>
       <w:pPr>
         <w:pStyle w:val="Ttulo2"/>
       </w:pPr>
       <w:r>
+        <w:t>5.2 Scripts de procesamiento (extraer_metro.py, Comunas.py)</w:t>
+      </w:r>
+    </w:p>
+    <w:p>
+      <w:pPr>
+        <w:jc w:val="both"/>
+      </w:pPr>
+      <w:r>
+        <w:rPr>
+          <w:rFonts w:eastAsia="Aptos" w:cs="Aptos"/>
+        </w:rPr>
+        <w:t xml:space="preserve">Todo el código fuente utilizado para la extracción, limpieza algorítmica y cruce de los datos geoespaciales se encuentra debidamente documentado y respaldado para revisión en el repositorio de control de versiones del grupo de trabajo. Este apartado incluye rutinas específicas desarrolladas en lenguaje Python, tales como el script principal </w:t>
+      </w:r>
+      <w:r>
+        <w:rPr>
+          <w:rFonts w:eastAsia="Consolas" w:cs="Consolas"/>
+        </w:rPr>
+        <w:t>extraer_metro.py</w:t>
+      </w:r>
+      <w:r>
+        <w:rPr>
+          <w:rFonts w:eastAsia="Aptos" w:cs="Aptos"/>
+        </w:rPr>
+        <w:t xml:space="preserve"> utilizado para filtrar la planimetría de las rutas, y el diccionario oficial </w:t>
+      </w:r>
+      <w:r>
+        <w:rPr>
+          <w:rFonts w:eastAsia="Consolas" w:cs="Consolas"/>
+        </w:rPr>
+        <w:t>Comunas.py</w:t>
+      </w:r>
+      <w:r>
+        <w:rPr>
+          <w:rFonts w:eastAsia="Aptos" w:cs="Aptos"/>
+        </w:rPr>
+        <w:t xml:space="preserve"> empleado computacionalmente para asignar de manera correcta cada estación geográfica a su correspondiente división administrativa metropolitana.</w:t>
+      </w:r>
+    </w:p>
+    <w:p>
+      <w:pPr>
+        <w:pStyle w:val="Ttulo2"/>
+      </w:pPr>
+      <w:r>
         <w:lastRenderedPageBreak/>
-        <w:t>5.2 Scripts de procesamiento (extraer_metro.py, Comunas.py)</w:t>
-      </w:r>
-    </w:p>
-    <w:p>
-      <w:pPr>
-        <w:jc w:val="both"/>
-      </w:pPr>
-      <w:r>
-        <w:rPr>
-          <w:rFonts w:eastAsia="Aptos" w:cs="Aptos"/>
-        </w:rPr>
-        <w:t xml:space="preserve">Todo el código fuente utilizado para la extracción, limpieza algorítmica y cruce de los datos geoespaciales se encuentra debidamente documentado y respaldado para revisión en el repositorio de control de versiones del grupo de trabajo. Este apartado incluye rutinas específicas desarrolladas en lenguaje Python, tales como el script principal </w:t>
-      </w:r>
-      <w:r>
-        <w:rPr>
-          <w:rFonts w:eastAsia="Consolas" w:cs="Consolas"/>
-        </w:rPr>
-        <w:t>extraer_metro.py</w:t>
-      </w:r>
-      <w:r>
-        <w:rPr>
-          <w:rFonts w:eastAsia="Aptos" w:cs="Aptos"/>
-        </w:rPr>
-        <w:t xml:space="preserve"> utilizado para filtrar la planimetría de las rutas, y el diccionario oficial </w:t>
-      </w:r>
-      <w:r>
-        <w:rPr>
-          <w:rFonts w:eastAsia="Consolas" w:cs="Consolas"/>
-        </w:rPr>
-        <w:t>Comunas.py</w:t>
-      </w:r>
-      <w:r>
-        <w:rPr>
-          <w:rFonts w:eastAsia="Aptos" w:cs="Aptos"/>
-        </w:rPr>
-        <w:t xml:space="preserve"> empleado computacionalmente para asignar de manera correcta cada estación geográfica a su correspondiente división administrativa metropolitana.</w:t>
-      </w:r>
-    </w:p>
-    <w:p>
-      <w:pPr>
-        <w:pStyle w:val="Ttulo2"/>
-      </w:pPr>
-      <w:r>
         <w:t>5.3 Tablas de datos agregados (CSV)</w:t>
       </w:r>
     </w:p>
@@ -1998,7 +1909,7 @@
         <w:rPr>
           <w:rFonts w:ascii="Aptos" w:eastAsia="Aptos" w:hAnsi="Aptos" w:cs="Aptos"/>
         </w:rPr>
-        <w:t>HTML/CSS. Tecnologías web utilizadas para el desarrollo de la infografía grupal, con tipografía Inter y tokens de diseño en paleta rojo-negro-blanco. Disponible en: https://github.com/Carlon-S/Grupo06_INF379_2026-1</w:t>
+        <w:t>Canva. Plataforma de diseño gráfico web utilizada para la construcción y maquetación de la infografía grupal. Disponible en: https://canva.link/5o6qz2aefvehxvn</w:t>
       </w:r>
     </w:p>
     <w:p/>
@@ -4039,6 +3950,7 @@
   <w:style w:type="character" w:default="1" w:styleId="Fuentedeprrafopredeter">
     <w:name w:val="Default Paragraph Font"/>
     <w:uiPriority w:val="1"/>
+    <w:semiHidden/>
     <w:unhideWhenUsed/>
   </w:style>
   <w:style w:type="table" w:default="1" w:styleId="Tablanormal">
@@ -4742,6 +4654,23 @@
 </file>
 
 <file path=customXml/item1.xml><?xml version="1.0" encoding="utf-8"?>
+<?mso-contentType ?>
+<FormTemplates xmlns="http://schemas.microsoft.com/sharepoint/v3/contenttype/forms">
+  <Display>DocumentLibraryForm</Display>
+  <Edit>DocumentLibraryForm</Edit>
+  <New>DocumentLibraryForm</New>
+</FormTemplates>
+</file>
+
+<file path=customXml/item2.xml><?xml version="1.0" encoding="utf-8"?>
+<p:properties xmlns:p="http://schemas.microsoft.com/office/2006/metadata/properties" xmlns:xsi="http://www.w3.org/2001/XMLSchema-instance" xmlns:pc="http://schemas.microsoft.com/office/infopath/2007/PartnerControls">
+  <documentManagement>
+    <_activity xmlns="5de54020-2ab9-4ebc-9c35-5626f568a252" xsi:nil="true"/>
+  </documentManagement>
+</p:properties>
+</file>
+
+<file path=customXml/item3.xml><?xml version="1.0" encoding="utf-8"?>
 <ct:contentTypeSchema xmlns:ct="http://schemas.microsoft.com/office/2006/metadata/contentType" xmlns:ma="http://schemas.microsoft.com/office/2006/metadata/properties/metaAttributes" ct:_="" ma:_="" ma:contentTypeName="Documento" ma:contentTypeID="0x010100DA44B841D672E645ABDF2BC2DFA524E3" ma:contentTypeVersion="15" ma:contentTypeDescription="Crear nuevo documento." ma:contentTypeScope="" ma:versionID="8dfe9976abef352f4f9a1ebbd181c549">
   <xsd:schema xmlns:xsd="http://www.w3.org/2001/XMLSchema" xmlns:xs="http://www.w3.org/2001/XMLSchema" xmlns:p="http://schemas.microsoft.com/office/2006/metadata/properties" xmlns:ns3="5de54020-2ab9-4ebc-9c35-5626f568a252" xmlns:ns4="088a5be4-97ed-4d44-96cf-cbcd0a715c12" targetNamespace="http://schemas.microsoft.com/office/2006/metadata/properties" ma:root="true" ma:fieldsID="f52d9e69be63817b6c2deb4dee97ebd6" ns3:_="" ns4:_="">
     <xsd:import namespace="5de54020-2ab9-4ebc-9c35-5626f568a252"/>
@@ -4974,24 +4903,25 @@
 </ct:contentTypeSchema>
 </file>
 
-<file path=customXml/item2.xml><?xml version="1.0" encoding="utf-8"?>
-<p:properties xmlns:p="http://schemas.microsoft.com/office/2006/metadata/properties" xmlns:xsi="http://www.w3.org/2001/XMLSchema-instance" xmlns:pc="http://schemas.microsoft.com/office/infopath/2007/PartnerControls">
-  <documentManagement>
-    <_activity xmlns="5de54020-2ab9-4ebc-9c35-5626f568a252" xsi:nil="true"/>
-  </documentManagement>
-</p:properties>
+<file path=customXml/itemProps1.xml><?xml version="1.0" encoding="utf-8"?>
+<ds:datastoreItem xmlns:ds="http://schemas.openxmlformats.org/officeDocument/2006/customXml" ds:itemID="{5556CDB6-2758-4870-AC83-488EB3B0C631}">
+  <ds:schemaRefs>
+    <ds:schemaRef ds:uri="http://schemas.microsoft.com/sharepoint/v3/contenttype/forms"/>
+  </ds:schemaRefs>
+</ds:datastoreItem>
 </file>
 
-<file path=customXml/item3.xml><?xml version="1.0" encoding="utf-8"?>
-<?mso-contentType ?>
-<FormTemplates xmlns="http://schemas.microsoft.com/sharepoint/v3/contenttype/forms">
-  <Display>DocumentLibraryForm</Display>
-  <Edit>DocumentLibraryForm</Edit>
-  <New>DocumentLibraryForm</New>
-</FormTemplates>
+<file path=customXml/itemProps2.xml><?xml version="1.0" encoding="utf-8"?>
+<ds:datastoreItem xmlns:ds="http://schemas.openxmlformats.org/officeDocument/2006/customXml" ds:itemID="{EF7B4F8C-8BDB-421F-987A-637537F4730F}">
+  <ds:schemaRefs>
+    <ds:schemaRef ds:uri="http://schemas.microsoft.com/office/2006/metadata/properties"/>
+    <ds:schemaRef ds:uri="http://schemas.microsoft.com/office/infopath/2007/PartnerControls"/>
+    <ds:schemaRef ds:uri="5de54020-2ab9-4ebc-9c35-5626f568a252"/>
+  </ds:schemaRefs>
+</ds:datastoreItem>
 </file>
 
-<file path=customXml/itemProps1.xml><?xml version="1.0" encoding="utf-8"?>
+<file path=customXml/itemProps3.xml><?xml version="1.0" encoding="utf-8"?>
 <ds:datastoreItem xmlns:ds="http://schemas.openxmlformats.org/officeDocument/2006/customXml" ds:itemID="{D328386D-7887-475A-A779-DF4DF5D25A0F}">
   <ds:schemaRefs>
     <ds:schemaRef ds:uri="http://schemas.microsoft.com/office/2006/metadata/contentType"/>
@@ -5008,22 +4938,4 @@
     <ds:schemaRef ds:uri="http://schemas.microsoft.com/internal/obd"/>
   </ds:schemaRefs>
 </ds:datastoreItem>
-</file>
-
-<file path=customXml/itemProps2.xml><?xml version="1.0" encoding="utf-8"?>
-<ds:datastoreItem xmlns:ds="http://schemas.openxmlformats.org/officeDocument/2006/customXml" ds:itemID="{EF7B4F8C-8BDB-421F-987A-637537F4730F}">
-  <ds:schemaRefs>
-    <ds:schemaRef ds:uri="http://schemas.microsoft.com/office/2006/metadata/properties"/>
-    <ds:schemaRef ds:uri="http://schemas.microsoft.com/office/infopath/2007/PartnerControls"/>
-    <ds:schemaRef ds:uri="5de54020-2ab9-4ebc-9c35-5626f568a252"/>
-  </ds:schemaRefs>
-</ds:datastoreItem>
-</file>
-
-<file path=customXml/itemProps3.xml><?xml version="1.0" encoding="utf-8"?>
-<ds:datastoreItem xmlns:ds="http://schemas.openxmlformats.org/officeDocument/2006/customXml" ds:itemID="{5556CDB6-2758-4870-AC83-488EB3B0C631}">
-  <ds:schemaRefs>
-    <ds:schemaRef ds:uri="http://schemas.microsoft.com/sharepoint/v3/contenttype/forms"/>
-  </ds:schemaRefs>
-</ds:datastoreItem>
 </file>
</xml_diff>